<commit_message>
Rebuild pathology foundation-model atlas with CRAN fastPLS 0.3
</commit_message>
<xml_diff>
--- a/manuscript/cover_letter_JTM.docx
+++ b/manuscript/cover_letter_JTM.docx
@@ -18,7 +18,7 @@
         <w:t xml:space="preserve">Date: </w:t>
       </w:r>
       <w:r>
-        <w:t xml:space="preserve"> 20 September 2026</w:t>
+        <w:t xml:space="preserve"> 29 September 2026</w:t>
       </w:r>
     </w:p>
     <w:p>
@@ -61,7 +61,7 @@
     </w:p>
     <w:p>
       <w:r>
-        <w:t>We submit this manuscript for consideration in Journal of Translational Medicine. We compare three released pathology representation pipelines, TITAN, Giga-SSL and Prov-GigaPath, in a patient-level TCGA benchmark across 32 cancers. The study evaluates direct genomic alterations separately from sequencing-derived burdens, transcriptomic signatures, computationally inferred immune-cell fractions, composite genomic-context scores and same-H&amp;E reference phenotypes.</w:t>
+        <w:t>We submit this manuscript for consideration in Journal of Translational Medicine. We compare three released pathology representation pipelines, TITAN, Giga-SSL and Prov-GigaPath, in a patient-level TCGA benchmark across 30 jointly represented cancers, alongside a larger supporting TITAN screen covering 32 cancers. The study evaluates direct genomic alterations separately from sequencing-derived burdens, transcriptomic signatures, computationally inferred immune-cell fractions, composite genomic-context scores and same-H&amp;E reference phenotypes.</w:t>
       </w:r>
     </w:p>
     <w:p>
@@ -856,9 +856,6 @@
     <w:qFormat/>
     <w:rsid w:val="00FC693F"/>
     <w:pPr>
-      <w:pBdr>
-        <w:bottom w:val="single" w:sz="8" w:space="4" w:color="4F81BD" w:themeColor="accent1"/>
-      </w:pBdr>
       <w:spacing w:after="300" w:line="480" w:lineRule="auto"/>
       <w:contextualSpacing/>
     </w:pPr>
@@ -1303,14 +1300,14 @@
     <w:qFormat/>
     <w:rsid w:val="00FC693F"/>
     <w:pPr>
-      <w:spacing w:line="240" w:lineRule="auto"/>
+      <w:spacing w:line="276" w:lineRule="auto"/>
     </w:pPr>
     <w:rPr>
       <w:rFonts w:ascii="Arial" w:hAnsi="Arial"/>
-      <w:b/>
+      <w:b w:val="0"/>
       <w:bCs/>
-      <w:i/>
-      <w:color w:val="4F81BD" w:themeColor="accent1"/>
+      <w:i w:val="0"/>
+      <w:color w:val="000000"/>
       <w:sz w:val="18"/>
       <w:szCs w:val="18"/>
     </w:rPr>

</xml_diff>

<commit_message>
Rebuild three-representation atlas with fastPLS 0.4
</commit_message>
<xml_diff>
--- a/manuscript/cover_letter_JTM.docx
+++ b/manuscript/cover_letter_JTM.docx
@@ -7,7 +7,7 @@
         <w:pStyle w:val="Title"/>
       </w:pPr>
       <w:r>
-        <w:t>Draft cover letter</w:t>
+        <w:t>Cover letter to Journal of Translational Medicine</w:t>
       </w:r>
     </w:p>
     <w:p>
@@ -18,7 +18,7 @@
         <w:t xml:space="preserve">Date: </w:t>
       </w:r>
       <w:r>
-        <w:t xml:space="preserve"> 29 September 2026</w:t>
+        <w:t xml:space="preserve"> 21 October 2026</w:t>
       </w:r>
     </w:p>
     <w:p>
@@ -51,7 +51,7 @@
         <w:t xml:space="preserve">Manuscript: </w:t>
       </w:r>
       <w:r>
-        <w:t xml:space="preserve"> Patient-level comparison of three released pathology representation pipelines with a common PLS-based probe across TCGA cancers</w:t>
+        <w:t xml:space="preserve"> Patient-level comparison of three released pathology slide representations with a common PLS-based probe across TCGA cancers</w:t>
       </w:r>
     </w:p>
     <w:p>
@@ -61,12 +61,12 @@
     </w:p>
     <w:p>
       <w:r>
-        <w:t>We submit this manuscript for consideration in Journal of Translational Medicine. We compare three released pathology representation pipelines, TITAN, Giga-SSL and Prov-GigaPath, in a patient-level TCGA benchmark across 30 jointly represented cancers, alongside a larger supporting TITAN screen covering 32 cancers. The study evaluates direct genomic alterations separately from sequencing-derived burdens, transcriptomic signatures, computationally inferred immune-cell fractions, composite genomic-context scores and same-H&amp;E reference phenotypes.</w:t>
+        <w:t>We submit this manuscript for consideration in Journal of Translational Medicine. We compare slide representations from TITAN, Giga-SSL and Prov-GigaPath using the same slides and patient-level validation folds across 30 jointly represented TCGA cancers. The study evaluates direct genomic alterations separately from sequencing-derived burdens, transcriptomic signatures, computationally inferred immune-cell fractions and composite genomic-context scores.</w:t>
       </w:r>
     </w:p>
     <w:p>
       <w:r>
-        <w:t>The work provides a reproducible translational research prioritisation resource. Its principal contribution is the matched use of identical patients, outcomes and folds across the three representation pipelines, combined with patient-first slide pooling, alternative-partition analyses, grouping by TCGA tissue-source-site code and explicit reporting of negative, ineligible and sample-size-limited results. The supporting permutation/FDR-filtered TITAN screen adds deeper internal qualification for one representation. PathoFMPred provides a secondary research interface and registry for applying compatible fitted models; it does not add validation evidence.</w:t>
+        <w:t>The work provides a reproducible translational research prioritisation resource. Its principal contribution is the matched use of identical patients, slides, outcomes and folds across the three representations, combined with patient-level slide pooling, alternative-partition analyses, grouping by TCGA tissue-source-site code and explicit reporting of negative, ineligible and sample-size-limited results. PathoFMPred provides a secondary R interface and registry for applying compatible fitted research models; it does not add validation evidence.</w:t>
       </w:r>
     </w:p>
     <w:p>
@@ -76,7 +76,7 @@
     </w:p>
     <w:p>
       <w:r>
-        <w:t>The accompanying manuscript, Supplementary Material, machine-readable companions and response document report the analysis scope, reference-label provenance, uncertainty limits, pathology-quality constraints, molecular-slide linkage, software access conditions and upstream representation terms. We hope that this transparent benchmark will support careful selection of candidates for independent translational validation.</w:t>
+        <w:t>The Supplement, two patient-report examples and a machine-readable results archive accompany the manuscript. Together, they document outcome provenance, validation, pathology and molecular-slide linkage, and software access conditions. The authors declare no competing interests. We hope this benchmark will help researchers select candidates for independent translational validation.</w:t>
       </w:r>
     </w:p>
     <w:p>
@@ -104,7 +104,6 @@
       <w:pgMar w:top="1134" w:right="1247" w:bottom="1134" w:left="1247" w:header="720" w:footer="720" w:gutter="0"/>
       <w:cols w:space="720"/>
       <w:docGrid w:linePitch="360"/>
-      <w:lnNumType w:countBy="1" w:restart="continuous"/>
     </w:sectPr>
   </w:body>
 </w:document>
@@ -117,10 +116,7 @@
       <w:pStyle w:val="Footer"/>
       <w:jc w:val="center"/>
     </w:pPr>
-    <w:r>
-      <w:t xml:space="preserve">Page </w:t>
-    </w:r>
-    <w:fldSimple w:instr="PAGE"/>
+    <w:r/>
   </w:p>
 </w:ftr>
 </file>
@@ -132,13 +128,7 @@
       <w:pStyle w:val="Header"/>
       <w:jc w:val="right"/>
     </w:pPr>
-    <w:r>
-      <w:rPr>
-        <w:color w:val="64748B"/>
-        <w:sz w:val="16"/>
-      </w:rPr>
-      <w:t>Draft cover letter to Journal of Translational Medicine</w:t>
-    </w:r>
+    <w:r/>
   </w:p>
 </w:hdr>
 </file>
@@ -507,7 +497,7 @@
     <w:qFormat/>
     <w:rsid w:val="00FC693F"/>
     <w:pPr>
-      <w:spacing w:after="100" w:line="480" w:lineRule="auto"/>
+      <w:spacing w:after="140" w:line="276" w:lineRule="auto"/>
     </w:pPr>
     <w:rPr>
       <w:rFonts w:ascii="Arial" w:hAnsi="Arial"/>
@@ -856,7 +846,7 @@
     <w:qFormat/>
     <w:rsid w:val="00FC693F"/>
     <w:pPr>
-      <w:spacing w:after="300" w:line="480" w:lineRule="auto"/>
+      <w:spacing w:after="300" w:line="264" w:lineRule="auto"/>
       <w:contextualSpacing/>
     </w:pPr>
     <w:rPr>
@@ -865,7 +855,7 @@
       <w:color w:val="000000"/>
       <w:spacing w:val="5"/>
       <w:kern w:val="28"/>
-      <w:sz w:val="40"/>
+      <w:sz w:val="32"/>
       <w:szCs w:val="52"/>
     </w:rPr>
   </w:style>

</xml_diff>

<commit_message>
Extend cancer-feature atlas to BRCA and publish Prov model access workflow
</commit_message>
<xml_diff>
--- a/manuscript/cover_letter_JTM.docx
+++ b/manuscript/cover_letter_JTM.docx
@@ -12,13 +12,7 @@
     </w:p>
     <w:p>
       <w:r>
-        <w:rPr>
-          <w:b/>
-        </w:rPr>
-        <w:t xml:space="preserve">Date: </w:t>
-      </w:r>
-      <w:r>
-        <w:t xml:space="preserve"> 21 October 2026</w:t>
+        <w:t>Date:  26 October 2026</w:t>
       </w:r>
     </w:p>
     <w:p>
@@ -45,13 +39,7 @@
     </w:p>
     <w:p>
       <w:r>
-        <w:rPr>
-          <w:b/>
-        </w:rPr>
-        <w:t xml:space="preserve">Manuscript: </w:t>
-      </w:r>
-      <w:r>
-        <w:t xml:space="preserve"> Patient-level comparison of three released pathology slide representations with a common PLS-based probe across TCGA cancers</w:t>
+        <w:t>Manuscript:  Cancer-specific prediction of genomic and immune-related features from pathology slide representations across 31 TCGA cancers</w:t>
       </w:r>
     </w:p>
     <w:p>
@@ -61,22 +49,22 @@
     </w:p>
     <w:p>
       <w:r>
-        <w:t>We submit this manuscript for consideration in Journal of Translational Medicine. We compare slide representations from TITAN, Giga-SSL and Prov-GigaPath using the same slides and patient-level validation folds across 30 jointly represented TCGA cancers. The study evaluates direct genomic alterations separately from sequencing-derived burdens, transcriptomic signatures, computationally inferred immune-cell fractions and composite genomic-context scores.</w:t>
+        <w:t>We submit this manuscript for consideration as a Research Article in Journal of Translational Medicine. We assembled a cancer-specific atlas of genomic and immune-related features estimated from haematoxylin-and-eosin slide representations. The analysis includes 31 TCGA cancers. For 30 cancers, we compared TITAN, Giga-SSL and Prov-GigaPath on identical slides and patient-level validation folds. We also analysed breast cancer with TITAN and Giga-SSL, the two representations available for that disease.</w:t>
       </w:r>
     </w:p>
     <w:p>
       <w:r>
-        <w:t>The work provides a reproducible translational research prioritisation resource. Its principal contribution is the matched use of identical patients, slides, outcomes and folds across the three representations, combined with patient-level slide pooling, alternative-partition analyses, grouping by TCGA tissue-source-site code and explicit reporting of negative, ineligible and sample-size-limited results. PathoFMPred provides a secondary R interface and registry for applying compatible fitted research models; it does not add validation evidence.</w:t>
+        <w:t>The study identifies which features are detectable within each cancer and shows how representation choice changes the result. We report direct genomic alterations alongside sequencing-derived burdens, RNA-derived pathways and inferred immune phenotypes, while keeping their reference sources distinct. A full cancer-by-feature inventory accompanies the manuscript. PathoFMPred, an R package developed for this study, applies compatible fitted research models; users may download the separate Prov-GigaPath coefficient collection on request through a checksum-verified function.</w:t>
       </w:r>
     </w:p>
     <w:p>
       <w:r>
-        <w:t>We believe the manuscript fits the journal's interests in Medical Bioinformatics, Molecular Pathology, Disease Biomarkers and Translational Imaging. It identifies tumour-feature associations that merit locked independent testing while showing where representation choice, downstream probe and cohort structure alter prioritisation. The study does not claim clinical validation, assay replacement or transportability beyond TCGA. We state the absence of an independent external cohort prominently and position every output as an internally derived research estimate.</w:t>
+        <w:t>We believe the work will interest readers in molecular pathology, translational imaging and medical bioinformatics. It offers a practical way to prioritize cancer-specific associations for independent study and to examine where multiple slide representations support the same feature. The patient-level design, provenance audit and research software make the atlas useful beyond a ranking of foundation models.</w:t>
       </w:r>
     </w:p>
     <w:p>
       <w:r>
-        <w:t>The Supplement, two patient-report examples and a machine-readable results archive accompany the manuscript. Together, they document outcome provenance, validation, pathology and molecular-slide linkage, and software access conditions. The authors declare no competing interests. We hope this benchmark will help researchers select candidates for independent translational validation.</w:t>
+        <w:t>The Supplementary Material and two COAD patient-report examples accompany the manuscript. The authors declare no competing interests and received no specific grant for this work.</w:t>
       </w:r>
     </w:p>
     <w:p>

</xml_diff>